<commit_message>
Adding page 2 of analysis
</commit_message>
<xml_diff>
--- a/Documentation/01_Business_Understanding.docx
+++ b/Documentation/01_Business_Understanding.docx
@@ -70,7 +70,7 @@
           <w:szCs w:val="28"/>
         </w:rPr>
         <w:pict w14:anchorId="13AA1849">
-          <v:rect id="_x0000_i1043" style="width:0;height:1.5pt" o:hralign="center" o:hrstd="t" o:hr="t" fillcolor="#a0a0a0" stroked="f"/>
+          <v:rect id="_x0000_i1025" style="width:0;height:1.5pt" o:hralign="center" o:hrstd="t" o:hr="t" fillcolor="#a0a0a0" stroked="f"/>
         </w:pict>
       </w:r>
     </w:p>
@@ -360,8 +360,6 @@
         </w:rPr>
       </w:pPr>
     </w:p>
-    <w:p/>
-    <w:p/>
     <w:p/>
     <w:p/>
     <w:sectPr>
@@ -1330,6 +1328,7 @@
   <w:style w:type="character" w:default="1" w:styleId="DefaultParagraphFont">
     <w:name w:val="Default Paragraph Font"/>
     <w:uiPriority w:val="1"/>
+    <w:semiHidden/>
     <w:unhideWhenUsed/>
   </w:style>
   <w:style w:type="table" w:default="1" w:styleId="TableNormal">

</xml_diff>